<commit_message>
refactor: completely sanitize project of Miro references and streamline academic UI for university defense
</commit_message>
<xml_diff>
--- a/docs/План_защиты_ВМ_ПР4_Микитенко_Ерепов_К_М.docx
+++ b/docs/План_защиты_ВМ_ПР4_Микитенко_Ерепов_К_М.docx
@@ -324,7 +324,7 @@
           <w:i/>
           <w:color w:val="2C3E50"/>
         </w:rPr>
-        <w:t xml:space="preserve">   - Дизайнером Кашиным С. оформлена интерактивная виртуальная доска проекта Miro;</w:t>
+        <w:t xml:space="preserve">   - Дизайнером Кашиным С. оформлена интерактивная виртуальная доска проекта Интерактивная доска проекта;</w:t>
       </w:r>
     </w:p>
     <w:p>
@@ -784,7 +784,7 @@
         <w:ind w:left="227"/>
       </w:pPr>
       <w:r>
-        <w:t>- **Виртуальная доска проекта (онлайн-портал Miro / Notion):** [https://kukes-misis.github.io/network-ethernet-project1/](https://kukes-misis.github.io/network-ethernet-project1/)</w:t>
+        <w:t>- **Виртуальная доска проекта (онлайн-портал Виртуальная интерактивная доска проекта):** [https://kukes-misis.github.io/network-ethernet-project1/](https://kukes-misis.github.io/network-ethernet-project1/)</w:t>
       </w:r>
     </w:p>
     <w:p>

</xml_diff>